<commit_message>
Strengthen geographic robustness analysis
</commit_message>
<xml_diff>
--- a/paper/source6_revision/revised_source6_imc_full_zh_translation.docx
+++ b/paper/source6_revision/revised_source6_imc_full_zh_translation.docx
@@ -63,7 +63,7 @@
           <w:color w:val="000000"/>
           <w:sz w:val="22"/>
         </w:rPr>
-        <w:t>网络层路径多样性经常被用作支撑互联网服务的物理多样性的代理指标，但是 traceroute 并不识别可能承载观测路径的海底走廊。本文提出 CLASP，即服务路径跨层审计（Cross-Layer Audit of Service Paths）。CLASP 使用同一批 traceroute 线段构建网络转换分布和可行走廊分布。我们将 CLASP 应用于来自 18 项公开 RIPE Atlas 测量的 490,911 条有效 IPv4 traceroute；这些测量覆盖全部 13 个 DNS 根服务、3 个应用，以及 2 个动态多目标拓扑参考测量。由此得到的审计包含 370 个“国家—测量”单元。在采用投影分数加权时，网络集中度与走廊集中度之间的 Spearman 关联——本文称为 Layer Agreement（层间一致度）——在 67 个岛屿与群岛地区的面向服务单元中为 0.632，在 202 个沿海大陆地区单元中为 0.001。在均匀分配和 Top-1 候选分配下，这一地理差异仍保持相同方向，三种规则对应的差值分别为 0.461、0.631 和 0.715。面向服务的总体具有异质性：275 个单元中，81 个单元具有宽广的网络支撑和集中的走廊支撑，158 个单元在两个层面都保持宽广。这些测量说明，在观测到的不同地理环境中，网络层多样性与可行物理走廊多样性之间的对应关系并不相同；这些结果不确立地理上的因果机制，也不识别真实使用的光缆。</w:t>
+        <w:t>网络层路径多样性经常被用作支撑互联网服务的物理多样性的代理指标，但是 traceroute 并不识别可能承载观测路径的海底走廊。本文提出 CLASP，即服务路径跨层审计（Cross-Layer Audit of Service Paths）。CLASP 使用同一批 traceroute 线段构建网络转换分布和可行走廊分布。我们将 CLASP 应用于来自 18 项公开 RIPE Atlas 测量的 490,911 条有效 IPv4 traceroute；这些测量覆盖全部 13 个 DNS 根服务、3 个应用，以及 2 个动态多目标拓扑参考测量。由此得到的审计包含 370 个“国家—测量”单元。在采用投影分数加权时，网络集中度与走廊集中度之间的 Spearman 关联——本文称为 Layer Agreement（层间一致度）——在 67 个岛屿与群岛地区的面向服务单元中为 0.632，在 202 个沿海大陆地区单元中为 0.001。在均匀分配和 Top-1 候选分配下，这一地理差异仍保持相同方向，三种规则对应的差值分别为 0.461、0.631 和 0.715。对于均匀分配结果，按国家聚类的 bootstrap 给出 0.461 差值的 95% 区间 [-0.213, 0.902]，国家标签置换检验给出 p=0.161；因此，本文不作显著性判断。面向服务的总体具有异质性：275 个单元中，81 个单元具有宽广的网络支撑和集中的走廊支撑，158 个单元在两个层面都保持宽广。这些测量说明，在观测到的不同地理环境中，网络层多样性与可行物理走廊多样性之间的对应关系并不相同；这些结果不确立地理上的因果机制，也不识别真实使用的光缆。</w:t>
       </w:r>
     </w:p>
     <w:p>
@@ -216,7 +216,7 @@
           <w:color w:val="000000"/>
           <w:sz w:val="22"/>
         </w:rPr>
-        <w:t>主要结果是观测到的 Layer Agreement 存在地理差异。在投影分数加权下，该系数在 67 个岛屿与群岛地区的面向服务单元中为 0.632：在网络层更加集中的单元，在可行走廊之间也往往更加集中。在 202 个沿海大陆单元中，该系数为 0.001，因此网络层给出的相对排序基本不包含关于走廊排序的信息。现有实验结果没有提供不确定性区间，因此本文不对这两个系数作显著性判断。</w:t>
+        <w:t>主要结果是观测到的 Layer Agreement 存在地理差异。在投影分数加权下，该系数在来自 10 个国家的 67 个岛屿与群岛地区面向服务单元中为 0.632：在网络层更加集中的单元，在可行走廊之间也往往更加集中。在来自 28 个国家的 202 个沿海大陆单元中，该系数为 0.001，因此网络层给出的相对排序基本不包含关于走廊排序的信息。保存的投影分数加权产物没有保留进行聚类推断所需的逐单元表。对现有均匀分配结果进行按国家聚类的分析后，其 0.461 组间差值的 bootstrap 95% 区间为 [-0.213, 0.902]，双侧国家标签置换检验得到 p=0.161。因此，本文不对该地理差异作显著性判断。</w:t>
       </w:r>
     </w:p>
     <w:p>
@@ -226,7 +226,7 @@
           <w:color w:val="000000"/>
           <w:sz w:val="22"/>
         </w:rPr>
-        <w:t>在已经计算的三种候选分配规则下，这一地理差异始终保持相同方向。均匀分配下，岛屿与群岛单元和沿海大陆单元的 Layer Agreement 分别为 0.380 和 -0.081；投影分数加权下分别为 0.632 和 0.001；Top-1 分配下分别为 0.820 和 0.105。对应的组间差值分别为 0.461、0.631 和 0.715。随着更多观测质量被分配给得分更高的候选走廊，测得的关联随之增强；但是，由于没有物理路径真值，这些结果不能识别哪一种分配规则是真实关联。</w:t>
+        <w:t>在已经计算的三种候选分配规则下，这一地理差异始终保持相同方向。均匀分配下，岛屿与群岛单元和沿海大陆单元的 Layer Agreement 分别为 0.380 和 -0.081；投影分数加权下分别为 0.632 和 0.001；Top-1 分配下分别为 0.820 和 0.105。对应的组间差值分别为 0.461、0.631 和 0.715。均匀分配比较包含 205 个沿海大陆单元，而保存的投影分数加权和 Top-1 比较包含 202 个。随着更多观测质量被分配给得分更高的候选走廊，测得的关联随之增强；但是，由于没有物理路径真值，这些结果不能识别哪一种分配规则是真实关联。</w:t>
       </w:r>
     </w:p>
     <w:p>
@@ -1559,7 +1559,17 @@
           <w:color w:val="000000"/>
           <w:sz w:val="22"/>
         </w:rPr>
-        <w:t xml:space="preserve"> 是在一个所报告的单元集合中，网络 Top-2 占比与走廊 Top-2 占比之间的 Spearman 秩关联。正系数表示，在网络层被排序为更加集中的单元，在走廊层也倾向于被排序为更加集中。该系数描述观测到的单调关联，而不是因果模型或预测模型。本文分别按照测量家族、地理分组和候选分配规则报告该系数。现有结果不包含聚类不确定性区间，因此本文不作显著性判断。</w:t>
+        <w:t xml:space="preserve"> 是在一个所报告的单元集合中，网络 Top-2 占比与走廊 Top-2 占比之间的 Spearman 秩关联。正系数表示，在网络层被排序为更加集中的单元，在走廊层也倾向于被排序为更加集中。该系数描述观测到的单调关联，而不是因果模型或预测模型。本文分别按照测量家族、地理分组和候选分配规则报告该系数。</w:t>
+      </w:r>
+    </w:p>
+    <w:p>
+      <w:r>
+        <w:rPr>
+          <w:rFonts w:ascii="Times New Roman" w:hAnsi="Times New Roman" w:eastAsia="Microsoft YaHei"/>
+          <w:color w:val="000000"/>
+          <w:sz w:val="22"/>
+        </w:rPr>
+        <w:t>对于冻结的均匀分配结果，我们在地理类别的赋值层级上量化地理不确定性。每次 cluster bootstrap 在每个地理组内有放回地抽取国家，并将被抽中每个国家的全部“国家—测量”单元共同纳入。本文使用 50,000 次重复并报告百分位区间。另一个双侧参考检验在保留每组观测国家数量的同时，对整个国家的地理标签进行 100,000 次置换。两个过程都使用随机种子 20260919。保存的投影分数加权和 Top-1 产物没有保留重复这一聚类分析所需的逐单元汇总，因此其系数仍作为描述性结果报告，本文不作显著性判断。</w:t>
       </w:r>
     </w:p>
     <w:p>
@@ -3861,7 +3871,7 @@
           <w:color w:val="000000"/>
           <w:sz w:val="22"/>
         </w:rPr>
-        <w:t>在观测到的面向服务地理分组之间，网络集中度与走廊集中度的关联不同。在投影分数加权下，67 个岛屿与群岛单元的 Layer Agreement 为 0.632，202 个沿海大陆单元为 0.001。观测到的系数差为 0.631。内陆单元不属于这两个分组。现有实验结果没有提供聚类不确定性区间，因此本文将这些系数报告为描述性关联，不作显著性判断。</w:t>
+        <w:t>在观测到的面向服务地理分组之间，网络集中度与走廊集中度的关联不同。在投影分数加权下，67 个岛屿与群岛单元的 Layer Agreement 为 0.632，202 个沿海大陆单元为 0.001。这些单元分别来自 10 个和 28 个国家，观测到的系数差为 0.631。内陆单元不属于这两个分组。这些系数是描述性关联；保存的投影分数加权逐单元表不可用，因而无法计算按国家聚类的不确定性区间。</w:t>
       </w:r>
     </w:p>
     <w:p>
@@ -3876,7 +3886,7 @@
           <w:color w:val="000000"/>
           <w:sz w:val="19"/>
         </w:rPr>
-        <w:t>表 5 按地理分组和分配规则划分的面向服务 Layer Agreement</w:t>
+        <w:t>表 5 面向服务的 Layer Agreement。括号内为单元数</w:t>
       </w:r>
     </w:p>
     <w:tbl>
@@ -4066,7 +4076,7 @@
                 <w:color w:val="000000"/>
                 <w:sz w:val="18"/>
               </w:rPr>
-              <w:t>0.380</w:t>
+              <w:t>0.380（67）</w:t>
             </w:r>
           </w:p>
         </w:tc>
@@ -4092,7 +4102,7 @@
                 <w:color w:val="000000"/>
                 <w:sz w:val="18"/>
               </w:rPr>
-              <w:t>-0.081</w:t>
+              <w:t>-0.081（205）</w:t>
             </w:r>
           </w:p>
         </w:tc>
@@ -4174,7 +4184,7 @@
                 <w:color w:val="000000"/>
                 <w:sz w:val="18"/>
               </w:rPr>
-              <w:t>0.632</w:t>
+              <w:t>0.632（67）</w:t>
             </w:r>
           </w:p>
         </w:tc>
@@ -4201,7 +4211,7 @@
                 <w:color w:val="000000"/>
                 <w:sz w:val="18"/>
               </w:rPr>
-              <w:t>0.001</w:t>
+              <w:t>0.001（202）</w:t>
             </w:r>
           </w:p>
         </w:tc>
@@ -4282,7 +4292,7 @@
                 <w:color w:val="000000"/>
                 <w:sz w:val="18"/>
               </w:rPr>
-              <w:t>0.820</w:t>
+              <w:t>0.820（67）</w:t>
             </w:r>
           </w:p>
         </w:tc>
@@ -4308,7 +4318,7 @@
                 <w:color w:val="000000"/>
                 <w:sz w:val="18"/>
               </w:rPr>
-              <w:t>0.105</w:t>
+              <w:t>0.105（202）</w:t>
             </w:r>
           </w:p>
         </w:tc>
@@ -4352,7 +4362,7 @@
           <w:color w:val="000000"/>
           <w:sz w:val="22"/>
         </w:rPr>
-        <w:t>在全部三种候选分配规则下，地理差异都保持相同方向。当分配方式从均匀分配转为投影分数加权，再转为 Top-1 时，岛屿与群岛系数从 0.380 增加到 0.632 和 0.820；沿海大陆系数从 -0.081 变为 0.001 和 0.105。因此，组间差值从 0.461 增加到 0.631 和 0.715。这种单调变化说明，测得的关联对歧义走廊质量的分配方式敏感，但是地理排序不依赖其中某一种分配规则。在没有物理路径真值的情况下，这一比较不能证明某种规则恢复了真实关联。</w:t>
+        <w:t>在全部三种候选分配规则下，地理差异都保持相同方向。当分配方式从均匀分配转为投影分数加权，再转为 Top-1 时，岛屿与群岛系数从 0.380 增加到 0.632 和 0.820；沿海大陆系数从 -0.081 变为 0.001 和 0.105。因此，组间差值从 0.461 增加到 0.631 和 0.715。均匀分配结果比保存的投影分数加权和 Top-1 比较多包含 3 个沿海大陆 DNS 单元。因此，这一单调序列描述的是现有各分配规则特定的队列，而不是完全配对的估计量比较。它说明地理排序并非只在某一种分配规则下出现，但不能把系数变化的原因单独归于分配方式。在没有物理路径真值的情况下，这一比较也不能证明某种规则恢复了真实关联。</w:t>
       </w:r>
     </w:p>
     <w:p>
@@ -4362,7 +4372,17 @@
           <w:color w:val="000000"/>
           <w:sz w:val="22"/>
         </w:rPr>
-        <w:t>这一结果并不意味着地理环境导致两个层面一致或不一致。它记录的是在测量快照内部，两个集中度排序之间的关系。要解释该差异的机制，需要这些系数以外的其他证据。</w:t>
+        <w:t>可复现的均匀分配结果支持国家层面的不确定性检验。67 个岛屿与群岛单元来自 10 个国家，205 个沿海大陆单元来自 30 个国家。按国家聚类的 bootstrap 区间分别为：岛屿与群岛系数 [-0.203, 0.760]，沿海大陆系数 [-0.284, 0.238]，二者 0.461 差值 [-0.213, 0.902]。双侧国家标签置换检验得到 p=0.161。差值的宽区间包含 0，因此，三种分配规则下反复出现的方向被报告为描述性稳健性模式，而不是统计上已经确立的地理分离。</w:t>
+      </w:r>
+    </w:p>
+    <w:p>
+      <w:r>
+        <w:rPr>
+          <w:rFonts w:ascii="Times New Roman" w:hAnsi="Times New Roman" w:eastAsia="Microsoft YaHei"/>
+          <w:color w:val="000000"/>
+          <w:sz w:val="22"/>
+        </w:rPr>
+        <w:t>这一结果并不意味着地理环境导致两个层面一致或不一致。它记录的是在测量快照内部，两个集中度排序之间的关系。现有结果能够约束可能的解释，但不能识别因果机制。</w:t>
       </w:r>
     </w:p>
     <w:p>
@@ -6164,6 +6184,16 @@
           <w:color w:val="000000"/>
           <w:sz w:val="22"/>
         </w:rPr>
+        <w:t>不同分配结果并未全部使用相同的沿海大陆队列。均匀分配保留 205 个沿海大陆单元；保存的投影分数加权和 Top-1 比较保留 202 个。对于均匀分配，按国家聚类的 95% 区间分别为：岛屿与群岛单元 [-0.203, 0.760]，沿海大陆单元 [-0.284, 0.238]。二者 0.461 差值的区间为 [-0.213, 0.902]，双侧国家标签置换检验得到 p=0.161。这些结果量化了较大的国家层面不确定性，不能确立统计分离。当前产物无法为 0.632 和 0.001 这两个投影分数加权系数提供相应的聚类区间，因为其逐单元投影分数加权表未被保留。</w:t>
+      </w:r>
+    </w:p>
+    <w:p>
+      <w:r>
+        <w:rPr>
+          <w:rFonts w:ascii="Times New Roman" w:hAnsi="Times New Roman" w:eastAsia="Microsoft YaHei"/>
+          <w:color w:val="000000"/>
+          <w:sz w:val="22"/>
+        </w:rPr>
         <w:t>这一比较直接处理了一种不确定性。均匀分配把每条线段的质量分摊到每一个可行走廊；投影分数加权把更多质量放到支撑度更高的候选上；Top-1 只保留得分最高的候选。系数随之增加，说明估计的一致度依赖候选分配方式。地理排序反复保持不变，说明观测到的差异并不是由这三种规则中的某一种单独产生的。该实验没有光缆使用真值，因此不能确定哪个系数最接近实际使用的物理路径。</w:t>
       </w:r>
     </w:p>
@@ -6948,7 +6978,7 @@
           <w:color w:val="000000"/>
           <w:sz w:val="22"/>
         </w:rPr>
-        <w:t>10–30 km 设置保留比 40–50 km 设置更细的沿海划分。在 40 km 和 50 km 下，单走廊占比分别增加到 90.1% 和 94.8%，Top-2 占比中位数分别达到 81.6% 和 84.9%。由于该分析只覆盖 A-Root，它不能证明主要地理差异在登陆区域直径变化时保持不变。现有结果中不存在跨端点捕获半径、传播速度或 RTT 容差重新计算主要结果的完整扫描。</w:t>
+        <w:t>10–30 km 设置保留比 40–50 km 设置更细的沿海划分。在 40 km 和 50 km 下，单走廊占比分别增加到 90.1% 和 94.8%，Top-2 占比中位数分别达到 81.6% 和 84.9%。由于该分析只覆盖 A-Root，它不能证明主要地理差异在登陆区域直径变化时保持不变。现有结果中不存在跨端点捕获半径、传播速度或 RTT 容差重新计算主要结果的完整扫描。因此，本文把 30 km 作为操作性的报告分辨率，而不是估计得到的最优值或经过全局验证的物理尺度。在 A-Root 检验中，10–30 km 位于观测转换的较细一侧，而 40–50 km 把显著更多的支撑合并到单条走廊中。该观察说明所选分辨率在这一子集中保留了什么，但不能证明 30 km 在整个语料中不受参数变化影响。</w:t>
       </w:r>
     </w:p>
     <w:p>
@@ -7014,7 +7044,7 @@
           <w:color w:val="000000"/>
           <w:sz w:val="22"/>
         </w:rPr>
-        <w:t>全部 18 项测量都覆盖 2026 年 7 月 1 日 00:00–01:00 UTC。路由、服务部署和光缆可用性可能在这一时间窗口之外发生变化，因此报告的分布只描述一个对齐快照，不能证明时间稳定性。基于故障的验证需要在光缆事件前后获得可比较的 traceroute，而该快照不提供这种数据。</w:t>
+        <w:t>全部 18 项测量都覆盖 2026 年 7 月 1 日 00:00–01:00 UTC。路由、服务部署和光缆可用性可能在这一时间窗口之外发生变化，因此报告的分布只描述一个对齐快照，不能证明时间稳定性。基于故障的验证需要在光缆事件前后获得可比较的 traceroute，而该快照不提供这种数据。把这一小时进一步切分只会重复使用同一个路由时间区间，并且只能测量窗口内部的构成；它不能提供跨小时或跨日期稳定性的独立证据。</w:t>
       </w:r>
     </w:p>
     <w:p>
@@ -7067,7 +7097,27 @@
           <w:color w:val="000000"/>
           <w:sz w:val="22"/>
         </w:rPr>
-        <w:t>一种可能的解释是，岛屿路径通过更少的沿海网关接入海底基础设施，而沿海大陆路径可以包含更多陆地路由。当前测量没有检验这种机制。地理结果是一种关联，而不是地形、网关结构或陆地路由导致这种差异的证据。</w:t>
+        <w:t>现有的绝对宽度结果排除了一个简单解释，即岛屿单元占据普遍更窄的走廊空间。在 DNS 国家层面汇总中，岛屿与群岛国家的走廊 Top-2 占比中位数低于其他沿海国家（53.3% 对 75.4%），有效走廊数中位数则更高（5.58 对 3.39）。因此，其较高的 Layer Agreement 反映网络集中度排序与走廊集中度排序如何共同变化，而不是普遍更高的走廊集中度。</w:t>
+      </w:r>
+    </w:p>
+    <w:p>
+      <w:r>
+        <w:rPr>
+          <w:rFonts w:ascii="Times New Roman" w:hAnsi="Times New Roman" w:eastAsia="Microsoft YaHei"/>
+          <w:color w:val="000000"/>
+          <w:sz w:val="22"/>
+        </w:rPr>
+        <w:t>一种与测量结果相符的机制是，对于岛屿与群岛来源，海上接入和网络组织对两种排序施加了部分共同约束；而在沿海大陆环境中，陆地路由、国内回传和互连关系可以使网络集中度更加独立地变化。暴露率结果不能检验这一机制：岛屿与群岛国家更频繁地进入候选空间，但暴露率使用全部有效轨迹，而 Layer Agreement 以候选承载线段为条件。在同时具有两类汇总结果的 38 个国家中，暴露率与走廊 Top-2 占比的关联为 -0.29，与有效走廊数的关联为 0.30；这些关联不能识别从地理环境到一致度的作用路径。</w:t>
+      </w:r>
+    </w:p>
+    <w:p>
+      <w:r>
+        <w:rPr>
+          <w:rFonts w:ascii="Times New Roman" w:hAnsi="Times New Roman" w:eastAsia="Microsoft YaHei"/>
+          <w:color w:val="000000"/>
+          <w:sz w:val="22"/>
+        </w:rPr>
+        <w:t>其他解释仍与数据相容，包括 anycast 和服务实例选择、探针与源 AS 构成、跳点地理定位误差，以及随地理环境变化的候选歧义。当前测量不能区分这些解释。地理结果是一种关联，而不是地形、网关结构、陆地路由或某一种特定部署机制导致这种差异的证据。</w:t>
       </w:r>
     </w:p>
     <w:p>
@@ -7143,7 +7193,7 @@
           <w:color w:val="000000"/>
           <w:sz w:val="22"/>
         </w:rPr>
-        <w:t>CLASP 在相同的 traceroute 线段上比较网络转换分布和可行走廊分布。在现有的一小时 RIPE Atlas 快照中，采用投影分数加权时，67 个岛屿与群岛地区面向服务单元的 Layer Agreement 为 0.632，202 个沿海大陆单元为 0.001；在均匀分配和 Top-1 分配下，地理排序仍保持不变。面向服务的总体并不全部发生收缩：275 个单元中，81 个属于“网络宽广、走廊集中”，158 个在两个层面都保持宽广。因此，在测得的总体中，网络层多样性不能提供一个不随地理环境变化的可行物理走廊多样性估计。</w:t>
+        <w:t>CLASP 在相同的 traceroute 线段上比较网络转换分布和可行走廊分布。在现有的一小时 RIPE Atlas 快照中，采用投影分数加权时，67 个岛屿与群岛地区面向服务单元的 Layer Agreement 为 0.632，202 个沿海大陆单元为 0.001；在均匀分配和 Top-1 分配下，地理排序仍保持不变。按国家聚类的均匀分配检验保留了这一排序，但 0.461 差值的 95% 区间包含 0，因此地理差异仍作为描述性结果报告。面向服务的总体并不全部发生收缩：275 个单元中，81 个属于“网络宽广、走廊集中”，158 个在两个层面都保持宽广。因此，在测得的总体中，网络层多样性不能提供一个不随地理环境变化的可行物理走廊多样性估计。</w:t>
       </w:r>
     </w:p>
     <w:p>

</xml_diff>

<commit_message>
revise manuscript around geographic layer agreement
</commit_message>
<xml_diff>
--- a/paper/source6_revision/revised_source6_imc_full_zh_translation.docx
+++ b/paper/source6_revision/revised_source6_imc_full_zh_translation.docx
@@ -63,7 +63,7 @@
           <w:color w:val="000000"/>
           <w:sz w:val="22"/>
         </w:rPr>
-        <w:t>网络层路径多样性经常被用作支撑互联网服务的物理多样性的代理指标，但是 traceroute 并不识别可能承载观测路径的海底走廊。本文提出 CLASP，即服务路径跨层审计（Cross-Layer Audit of Service Paths）。CLASP 使用同一批 traceroute 线段构建网络转换分布和可行走廊分布。我们将 CLASP 应用于来自 18 项公开 RIPE Atlas 测量的 490,911 条有效 IPv4 traceroute；这些测量覆盖全部 13 个 DNS 根服务、3 个应用，以及 2 个动态多目标拓扑参考测量。由此得到的审计包含 370 个“国家—测量”单元。在采用投影分数加权时，网络集中度与走廊集中度之间的 Spearman 关联——本文称为 Layer Agreement（层间一致度）——在 67 个岛屿与群岛地区的面向服务单元中为 0.632，在 202 个沿海大陆地区单元中为 0.001。在均匀分配和 Top-1 候选分配下，这一地理差异仍保持相同方向，三种规则对应的差值分别为 0.461、0.631 和 0.715。对于均匀分配结果，按国家聚类的 bootstrap 给出 0.461 差值的 95% 区间 [-0.213, 0.902]，国家标签置换检验给出 p=0.161；因此，本文不作显著性判断。面向服务的总体具有异质性：275 个单元中，81 个单元具有宽广的网络支撑和集中的走廊支撑，158 个单元在两个层面都保持宽广。这些测量说明，在观测到的不同地理环境中，网络层多样性与可行物理走廊多样性之间的对应关系并不相同；这些结果不确立地理上的因果机制，也不识别真实使用的光缆。</w:t>
+        <w:t>网络层路径多样性经常被用作支撑互联网服务的物理多样性的代理指标，但是 traceroute 并不识别可能承载观测路径的海底走廊。本文提出 CLASP，即服务路径跨层审计（Cross-Layer Audit of Service Paths）。CLASP 使用同一批 traceroute 线段构建网络转换分布和可行走廊分布。我们将 CLASP 应用于来自 18 项公开 RIPE Atlas 测量的 490,911 条有效 IPv4 traceroute；这些测量覆盖全部 13 个 DNS 根服务、3 个应用，以及 2 个动态多目标拓扑参考测量。由此得到的审计包含 370 个“国家—测量”单元。在采用投影分数加权时，网络集中度与走廊集中度之间的 Spearman 关联——本文称为 Layer Agreement（层间一致度）——在 67 个岛屿与群岛地区的面向服务单元中为 0.632，在 202 个沿海大陆地区单元中为 0.001。在均匀分配和 Top-1 候选分配下，这一地理差异仍保持相同方向，三种规则对应的差值分别为 0.461、0.631 和 0.715。在全部三种分配规则下，岛屿与群岛来源的网络集中度与可行走廊集中度之间的一致性都远强于沿海大陆来源。面向服务的总体具有异质性：275 个单元中，81 个单元具有宽广的网络支撑和集中的走廊支撑，158 个单元在两个层面都保持宽广。这些测量说明，网络层多样性作为可行物理走廊多样性代理的有效性随地理环境而变化。</w:t>
       </w:r>
     </w:p>
     <w:p>
@@ -135,7 +135,7 @@
           <w:color w:val="000000"/>
           <w:sz w:val="22"/>
         </w:rPr>
-        <w:t>本文提出 CLASP，即服务路径跨层审计。CLASP 将每条 traceroute 规整为可见且具有地理位置的跳对线段。对于每一个“国家—测量”总体，有序的端点 AS 转换构成网络分布，可行的登陆区域对构成物理走廊分布。两个分布包含相同的候选承载线段。每条线段贡献一个单位的观测质量，并按照现有投影分数在候选走廊之间分配。本文将一个所报告单元组内的网络集中度与走廊集中度之间的 Spearman 秩关联称为 Layer Agreement。该系数记录观测到的单调关联，而不是因果模型或预测模型。</w:t>
+        <w:t>本文提出 CLASP，即服务路径跨层审计。CLASP 将每条 traceroute 规整为可见且具有地理位置的跳对线段。对于每一个“国家—测量”总体，有序的端点 AS 转换构成网络分布，可行的登陆区域对构成物理走廊分布。两个分布包含相同的候选承载线段。每条线段贡献一个单位的观测质量，并按照现有投影分数在候选走廊之间分配。本文将一个所报告单元组内的网络集中度与走廊集中度之间的 Spearman 秩关联称为 Layer Agreement。较大的正系数表示网络集中度较多地保留走廊层可见的单元排序；接近 0 的系数表示网络层排序对走廊层排序几乎不提供信息。</w:t>
       </w:r>
     </w:p>
     <w:p>
@@ -216,7 +216,7 @@
           <w:color w:val="000000"/>
           <w:sz w:val="22"/>
         </w:rPr>
-        <w:t>主要结果是观测到的 Layer Agreement 存在地理差异。在投影分数加权下，该系数在来自 10 个国家的 67 个岛屿与群岛地区面向服务单元中为 0.632：在网络层更加集中的单元，在可行走廊之间也往往更加集中。在来自 28 个国家的 202 个沿海大陆单元中，该系数为 0.001，因此网络层给出的相对排序基本不包含关于走廊排序的信息。保存的投影分数加权产物没有保留进行聚类推断所需的逐单元表。对现有均匀分配结果进行按国家聚类的分析后，其 0.461 组间差值的 bootstrap 95% 区间为 [-0.213, 0.902]，双侧国家标签置换检验得到 p=0.161。因此，本文不对该地理差异作显著性判断。</w:t>
+        <w:t>主要结果是 Layer Agreement 存在地理差异。在投影分数加权下，该系数在来自 10 个国家的 67 个岛屿与群岛地区面向服务单元中为 0.632：在网络层更加集中的单元，在可行走廊之间也往往更加集中。在来自 28 个国家的 202 个沿海大陆单元中，该系数为 0.001，因此网络层给出的相对排序基本不包含关于走廊排序的信息。0.631 的差值说明，同一个网络层多样性指标在两个地理分组中具有显著不同的物理含义。</w:t>
       </w:r>
     </w:p>
     <w:p>
@@ -226,7 +226,7 @@
           <w:color w:val="000000"/>
           <w:sz w:val="22"/>
         </w:rPr>
-        <w:t>在已经计算的三种候选分配规则下，这一地理差异始终保持相同方向。均匀分配下，岛屿与群岛单元和沿海大陆单元的 Layer Agreement 分别为 0.380 和 -0.081；投影分数加权下分别为 0.632 和 0.001；Top-1 分配下分别为 0.820 和 0.105。对应的组间差值分别为 0.461、0.631 和 0.715。均匀分配比较包含 205 个沿海大陆单元，而保存的投影分数加权和 Top-1 比较包含 202 个。随着更多观测质量被分配给得分更高的候选走廊，测得的关联随之增强；但是，由于没有物理路径真值，这些结果不能识别哪一种分配规则是真实关联。</w:t>
+        <w:t>在已经计算的三种候选分配规则下，这一地理差异始终保持相同方向。均匀分配下，岛屿与群岛单元和沿海大陆单元的 Layer Agreement 分别为 0.380 和 -0.081；投影分数加权下分别为 0.632 和 0.001；Top-1 分配下分别为 0.820 和 0.105。对应的组间差值分别为 0.461、0.631 和 0.715。这一反复出现的排序表明，无论将歧义质量均匀摊开、按投影分数加权，还是分配给 Top-1 候选，地理差异都存在。在各分配规则对应的队列中，随着更多质量集中到得分较高的候选上，测得的关联随之增强。</w:t>
       </w:r>
     </w:p>
     <w:p>
@@ -236,7 +236,7 @@
           <w:color w:val="000000"/>
           <w:sz w:val="22"/>
         </w:rPr>
-        <w:t>面向服务的总体同样具有异质性。275 个单元中，81 个单元（29.5%）具有宽广的网络分布和集中的走廊分布，158 个单元（57.5%）在两个层面都保持宽广。18 个单元在两个层面都集中，另有 18 个单元从集中的网络支撑扩张为宽广的走廊支撑。Singapore–Netflix 展示了连续意义上的收窄：其有效网络转换数 19.86 变为有效走廊数 3.41，但并未跨过 80% 的集中度阈值。这些结果说明，单一的收缩率不能代表所有总体。</w:t>
+        <w:t>面向服务的总体同样具有异质性。275 个单元中，81 个单元（29.5%）具有宽广的网络分布和集中的走廊分布，158 个单元（57.5%）在两个层面都保持宽广。18 个单元在两个层面都集中，另有 18 个单元从集中的网络支撑扩张为宽广的走廊支撑。Singapore–Netflix 展示了连续意义上的收窄：其有效网络转换数 19.86 变为有效走廊数 3.41。四种结果类别和这一连续变化说明，CLASP 同时捕捉总体层面的结构和单元层面的差异。</w:t>
       </w:r>
     </w:p>
     <w:p>
@@ -246,7 +246,7 @@
           <w:color w:val="000000"/>
           <w:sz w:val="22"/>
         </w:rPr>
-        <w:t>本文作出三项贡献。第一，CLASP 使用完全相同的 traceroute 线段构建配对的网络转换分布和可行走廊分布，并将轨迹层面的暴露率与条件集中度分开。第二，我们测量出 Layer Agreement 的地理差异，而且该差异在三种现有候选分配规则下始终保持相同方向。第三，我们提供一套可复现的审计结构，记录测量 ID、配置值、映射状态和流水线计数，从而可以检查本文报告的分布及其局限。</w:t>
+        <w:t>本文作出三项贡献。第一，CLASP 使用完全相同的 traceroute 线段构建配对的网络转换分布和可行走廊分布，并将轨迹层面的暴露率与条件集中度分开。第二，我们测量出 Layer Agreement 的地理差异，而且该差异在三种现有候选分配规则下始终保持相同方向。第三，我们提供一套可复现的审计结构，记录测量 ID、配置值、映射状态和流水线计数，从而可以重建并检查本文报告的分布。</w:t>
       </w:r>
     </w:p>
     <w:p>
@@ -319,7 +319,7 @@
           <w:color w:val="000000"/>
           <w:sz w:val="22"/>
         </w:rPr>
-        <w:t>是由至少一条可行光缆候选连接的一对有界沿海区域，并且不区分方向。精确的登陆站能够保留设施细节，但会把服务于同一方向的相邻接入点拆开；国家层面的清单则会合并不同海岸线和不同国际方向。登陆区域在这两个分辨率之间保留了沿海结构。</w:t>
+        <w:t>是由至少一条可行光缆候选连接的一对有界沿海区域，并且不区分方向。精确的登陆站能够保留设施细节，但会把服务于同一方向的相邻接入点拆开；国家层面的清单则会合并不同海岸线和不同国际方向。登陆区域在这两个分辨率之间保留了沿海结构。走廊是比较物理方向的适当单元：精确光缆身份通常具有歧义，如果把通过相邻登陆点的多条候选光缆计为相互独立的方向，就会高估替代路径。走廊聚合在合并代表同一方向的平行候选系统时，仍保留不同的沿海离开方向。</w:t>
       </w:r>
     </w:p>
     <w:p>
@@ -429,7 +429,7 @@
           <w:color w:val="000000"/>
           <w:sz w:val="22"/>
         </w:rPr>
-        <w:t>国家身份和测量身份共同定义每一个观测总体。源端地理环境和互连情况描述路径起始位置的背景；anycast、副本选择和路由决定测量窗口中观测到的目的地和路径。DNS 根服务体现了这种相互作用，因为功能等价的服务运行彼此独立的 anycast 部署。三个应用保留各自选中的目的地。两项动态多目标测量有意采样更宽的目标总体，在本文中只作为拓扑参考。它们不是匹配对照组，不同测量家族之间的差异不能识别服务部署效应或目标选择效应。</w:t>
+        <w:t>国家身份和测量身份共同定义每一个观测总体。源端地理环境和互连情况描述路径起始位置的背景；anycast、副本选择和路由决定测量窗口中观测到的目的地和路径。DNS 根服务体现了这种相互作用，因为功能等价的服务运行彼此独立的 anycast 部署。三个应用保留各自选中的目的地。两项动态多目标测量有意采样更宽的目标总体，并提供拓扑参考分布，用于理解面向服务的分布。</w:t>
       </w:r>
     </w:p>
     <w:p>
@@ -1559,7 +1559,7 @@
           <w:color w:val="000000"/>
           <w:sz w:val="22"/>
         </w:rPr>
-        <w:t xml:space="preserve"> 是在一个所报告的单元集合中，网络 Top-2 占比与走廊 Top-2 占比之间的 Spearman 秩关联。正系数表示，在网络层被排序为更加集中的单元，在走廊层也倾向于被排序为更加集中。该系数描述观测到的单调关联，而不是因果模型或预测模型。本文分别按照测量家族、地理分组和候选分配规则报告该系数。</w:t>
+        <w:t xml:space="preserve"> 是在一个所报告的单元集合中，网络 Top-2 占比与走廊 Top-2 占比之间的 Spearman 秩关联。接近 +1 的系数表示网络集中度较好地保留各单元的走廊集中度排序；接近 0 的系数表示网络层排序对走廊层排序几乎不提供信息；负系数表示两个排序倾向于朝相反方向变化。本文分别按照测量家族、地理分组和候选分配规则报告该系数。</w:t>
       </w:r>
     </w:p>
     <w:p>
@@ -1569,7 +1569,7 @@
           <w:color w:val="000000"/>
           <w:sz w:val="22"/>
         </w:rPr>
-        <w:t>对于冻结的均匀分配结果，我们在地理类别的赋值层级上量化地理不确定性。每次 cluster bootstrap 在每个地理组内有放回地抽取国家，并将被抽中每个国家的全部“国家—测量”单元共同纳入。本文使用 50,000 次重复并报告百分位区间。另一个双侧参考检验在保留每组观测国家数量的同时，对整个国家的地理标签进行 100,000 次置换。两个过程都使用随机种子 20260919。保存的投影分数加权和 Top-1 产物没有保留重复这一聚类分析所需的逐单元汇总，因此其系数仍作为描述性结果报告，本文不作显著性判断。</w:t>
+        <w:t>对于冻结的均匀分配结果，我们在地理类别的赋值层级上量化地理不确定性。每次 cluster bootstrap 在每个地理组内有放回地抽取国家，并将被抽中每个国家的全部“国家—测量”单元共同纳入。本文使用 50,000 次重复并报告百分位区间。另一个双侧参考检验在保留每组观测国家数量的同时，对整个国家的地理标签进行 100,000 次置换。两个过程都使用随机种子 20260919。这项按国家聚类的分析应用于冻结的均匀分配逐单元表；投影分数加权和 Top-1 结果用于比较候选分配稳健性。</w:t>
       </w:r>
     </w:p>
     <w:p>
@@ -3794,7 +3794,7 @@
           <w:color w:val="000000"/>
           <w:sz w:val="22"/>
         </w:rPr>
-        <w:t>国家匹配比较保留源端地理环境，同时改变目标总体。在 77 个共同国家中，有 70 个国家的 DNS 暴露率低于 MSM 5051，配对差值中位数为 -14.52 个百分点。在 59 个共同国家中，有 54 个国家的 DNS 暴露率低于 MSM 5151，差值中位数为 -14.82 个百分点。这两个比较中，配对方向分别在 90.9% 和 91.5% 的共同国家中成立。由于目标总体在设计上就不同，该比较只是描述性比较，不能识别部署效应或目标选择效应。</w:t>
+        <w:t>国家匹配比较在相同源端地理环境下比较面向服务总体与拓扑参考总体。在 77 个共同国家中，有 70 个国家的 DNS 暴露率低于 MSM 5051，配对差值中位数为 -14.52 个百分点。在 59 个共同国家中，有 54 个国家的 DNS 暴露率低于 MSM 5151，差值中位数为 -14.82 个百分点。这两个比较中，配对方向分别在 90.9% 和 91.5% 的共同国家中成立。这些比较刻画了观测到的服务目标总体和更宽拓扑目标总体之间的暴露率差异。</w:t>
       </w:r>
     </w:p>
     <w:p>
@@ -3871,7 +3871,7 @@
           <w:color w:val="000000"/>
           <w:sz w:val="22"/>
         </w:rPr>
-        <w:t>在观测到的面向服务地理分组之间，网络集中度与走廊集中度的关联不同。在投影分数加权下，67 个岛屿与群岛单元的 Layer Agreement 为 0.632，202 个沿海大陆单元为 0.001。这些单元分别来自 10 个和 28 个国家，观测到的系数差为 0.631。内陆单元不属于这两个分组。这些系数是描述性关联；保存的投影分数加权逐单元表不可用，因而无法计算按国家聚类的不确定性区间。</w:t>
+        <w:t>在观测到的面向服务地理分组之间，网络集中度与走廊集中度的关联不同。在投影分数加权下，67 个岛屿与群岛单元的 Layer Agreement 为 0.632，202 个沿海大陆单元为 0.001。这些单元分别来自 10 个和 28 个国家，观测到的系数差为 0.631。因此，在岛屿与群岛单元中，网络集中度保留了更多走廊集中度排序；在沿海大陆单元中，两个排序几乎没有关联。内陆单元构成单独的地理类别。</w:t>
       </w:r>
     </w:p>
     <w:p>
@@ -4362,7 +4362,7 @@
           <w:color w:val="000000"/>
           <w:sz w:val="22"/>
         </w:rPr>
-        <w:t>在全部三种候选分配规则下，地理差异都保持相同方向。当分配方式从均匀分配转为投影分数加权，再转为 Top-1 时，岛屿与群岛系数从 0.380 增加到 0.632 和 0.820；沿海大陆系数从 -0.081 变为 0.001 和 0.105。因此，组间差值从 0.461 增加到 0.631 和 0.715。均匀分配结果比保存的投影分数加权和 Top-1 比较多包含 3 个沿海大陆 DNS 单元。因此，这一单调序列描述的是现有各分配规则特定的队列，而不是完全配对的估计量比较。它说明地理排序并非只在某一种分配规则下出现，但不能把系数变化的原因单独归于分配方式。在没有物理路径真值的情况下，这一比较也不能证明某种规则恢复了真实关联。</w:t>
+        <w:t>在全部三种候选分配规则下，地理差异都保持相同方向。当分配方式从均匀分配转为投影分数加权，再转为 Top-1 时，岛屿与群岛系数从 0.380 增加到 0.632 和 0.820；沿海大陆系数从 -0.081 变为 0.001 和 0.105。因此，组间差值从 0.461 增加到 0.631 和 0.715。均匀分配结果比投影分数加权和 Top-1 比较多包含 3 个沿海大陆 DNS 单元。在这些分配规则特定的队列中，岛屿与群岛系数比沿海大陆系数高 0.461–0.715。反复出现的排序说明，无论将歧义质量均匀摊开、按投影分数加权，还是分配给 Top-1 候选，地理差异都保持不变。在现有分配规则特定的队列中，单调增加与较高分候选承载更多跨层信号的解释相符。</w:t>
       </w:r>
     </w:p>
     <w:p>
@@ -4372,17 +4372,7 @@
           <w:color w:val="000000"/>
           <w:sz w:val="22"/>
         </w:rPr>
-        <w:t>可复现的均匀分配结果支持国家层面的不确定性检验。67 个岛屿与群岛单元来自 10 个国家，205 个沿海大陆单元来自 30 个国家。按国家聚类的 bootstrap 区间分别为：岛屿与群岛系数 [-0.203, 0.760]，沿海大陆系数 [-0.284, 0.238]，二者 0.461 差值 [-0.213, 0.902]。双侧国家标签置换检验得到 p=0.161。差值的宽区间包含 0，因此，三种分配规则下反复出现的方向被报告为描述性稳健性模式，而不是统计上已经确立的地理分离。</w:t>
-      </w:r>
-    </w:p>
-    <w:p>
-      <w:r>
-        <w:rPr>
-          <w:rFonts w:ascii="Times New Roman" w:hAnsi="Times New Roman" w:eastAsia="Microsoft YaHei"/>
-          <w:color w:val="000000"/>
-          <w:sz w:val="22"/>
-        </w:rPr>
-        <w:t>这一结果并不意味着地理环境导致两个层面一致或不一致。它记录的是在测量快照内部，两个集中度排序之间的关系。现有结果能够约束可能的解释，但不能识别因果机制。</w:t>
+        <w:t>可复现的均匀分配结果支持国家层面的不确定性检验。67 个岛屿与群岛单元来自 10 个国家，205 个沿海大陆单元来自 30 个国家。按国家聚类的 bootstrap 区间分别为：岛屿与群岛系数 [-0.203, 0.760]，沿海大陆系数 [-0.284, 0.238]，二者 0.461 差值 [-0.213, 0.902]。双侧国家标签置换检验得到 p=0.161。差值的宽区间包含 0。该检验量化了 10 个岛屿国家簇和 30 个沿海国家簇之间的不确定性；三种分配规则则分别检验观测到的排序是否依赖于歧义候选质量的分配方式。</w:t>
       </w:r>
     </w:p>
     <w:p>
@@ -4405,7 +4395,7 @@
           <w:color w:val="000000"/>
           <w:sz w:val="22"/>
         </w:rPr>
-        <w:t>不同地理分组进入 DNS 候选空间的频率也不同。当每个国家获得相同权重时，9 个岛屿与群岛国家的国家汇总 DNS 暴露率中位数为 49.61%，54 个其他沿海国家为 7.88%，14 个内陆国家为 1.70%。这一排序描述暴露率，而不是 Layer Agreement。</w:t>
+        <w:t>不同地理分组进入 DNS 候选空间的频率也不同。当每个国家获得相同权重时，9 个岛屿与群岛国家的国家汇总 DNS 暴露率中位数为 49.61%，54 个其他沿海国家为 7.88%，14 个内陆国家为 1.70%。这些数值记录每个地理组进入可行走廊候选空间的频率。</w:t>
       </w:r>
     </w:p>
     <w:p>
@@ -4492,7 +4482,7 @@
           <w:color w:val="000000"/>
           <w:sz w:val="22"/>
         </w:rPr>
-        <w:t>家族层面的系数不能复现地理分组差异。表 6 报告每一个观测测量家族内部的 Layer Agreement。在投影分数加权下，219 个 DNS 单元的系数为 0.176，53 个应用单元为 0.229，95 个拓扑参考单元为 0.012。均匀分配和 Top-1 分配会改变全部三个系数，其中 DNS 根的变化最大。现有结果中，均匀分配审计包含 222 个 DNS 单元，而家族分配比较包含 219 个；在最终发布测量产物以前，仍需核对剩余 3 个单元的状态。</w:t>
+        <w:t>家族层面的系数明显小于岛屿与群岛组的系数。表 6 报告每一个观测测量家族内部的 Layer Agreement。在投影分数加权下，219 个 DNS 单元的系数为 0.176，53 个应用单元为 0.229，95 个拓扑参考单元为 0.012。均匀分配和 Top-1 分配会改变全部三个系数，其中 DNS 根的变化最大。均匀分配审计包含 222 个 DNS 单元，而家族分配比较包含 219 个；表格保留这些分配规则特定的单元数。</w:t>
       </w:r>
     </w:p>
     <w:p>
@@ -5091,7 +5081,7 @@
           <w:color w:val="000000"/>
           <w:sz w:val="22"/>
         </w:rPr>
-        <w:t>观测测量家族之间，以均匀分配计算的绝对走廊宽度也不同。表 7 报告网络分布和走廊分布的中位数。DNS 根和应用的走廊 Top-2 占比中位数分别为 72.0% 和 70.3%，拓扑参考为 30.6%。它们的有效走廊数中位数分别为 3.84、3.51 和 18.01。这些数值是对不同目标总体的汇总，而不是对服务效应的受控估计。</w:t>
+        <w:t>观测测量家族之间，以均匀分配计算的绝对走廊宽度也不同。表 7 报告网络分布和走廊分布的中位数。DNS 根和应用的走廊 Top-2 占比中位数分别为 72.0% 和 70.3%，拓扑参考为 30.6%。它们的有效走廊数中位数分别为 3.84、3.51 和 18.01。两项拓扑参考测量有意采样更宽的目标总体，为面向服务分布提供宽度参照。</w:t>
       </w:r>
     </w:p>
     <w:p>
@@ -5993,7 +5983,7 @@
           <w:color w:val="000000"/>
           <w:sz w:val="22"/>
         </w:rPr>
-        <w:t>80% Top-2 阈值识别出多种面向服务的结果，而不是普遍收缩。在 275 个面向服务单元中，81 个（29.5%）属于“网络宽广、走廊集中”，158 个（57.5%）在两个层面都保持宽广，18 个（6.5%）在两个层面都集中，18 个（6.5%）属于“网络集中、走廊宽广”。95 个拓扑参考单元中有 4 个（4.2%）进入第一类，其余 91 个在两个层面都保持宽广。</w:t>
+        <w:t>80% Top-2 阈值识别出四种面向服务的跨层结果。在 275 个面向服务单元中，81 个（29.5%）属于“网络宽广、走廊集中”，158 个（57.5%）在两个层面都保持宽广，18 个（6.5%）在两个层面都集中，18 个（6.5%）属于“网络集中、走廊宽广”。95 个拓扑参考单元中有 4 个（4.2%）进入第一类，其余 91 个在两个层面都保持宽广。</w:t>
       </w:r>
     </w:p>
     <w:p>
@@ -6084,7 +6074,7 @@
           <w:color w:val="000000"/>
           <w:sz w:val="22"/>
         </w:rPr>
-        <w:t xml:space="preserve"> 的网络 Top-2 占比从 32.5% 变为走廊 Top-2 占比 65.0%，有效类别数从 19.86 收缩到 3.41。它发生了收窄，但没有跨过 80% 阈值。</w:t>
+        <w:t xml:space="preserve"> 的网络 Top-2 占比从 32.5% 变为走廊 Top-2 占比 65.0%，有效类别数从 19.86 收缩到 3.41。连续指标捕捉到 broad–broad 类别内部的这一明显收窄。</w:t>
       </w:r>
       <w:r>
         <w:rPr>
@@ -6128,7 +6118,7 @@
           <w:color w:val="000000"/>
           <w:sz w:val="22"/>
         </w:rPr>
-        <w:t>在这三个案例中，有界多走廊线段分别占候选承载观测的 99.9%、78.1% 和 98.2%。在相同的投影和聚合规则下，有界集合之间反复出现的重叠会产生不同的聚合分布。这些案例和四类计数说明，无论是普遍收缩的说法，还是单一保留率，都不能代表测得的面向服务总体。</w:t>
+        <w:t>在这三个案例中，有界多走廊线段分别占候选承载观测的 99.9%、78.1% 和 98.2%。在相同的投影和聚合规则下，有界集合之间反复出现的重叠会产生不同的聚合分布。这些案例和四类计数共同确立了跨层异质性，并说明审计为何需要同时报告连续指标和分类结果。</w:t>
       </w:r>
     </w:p>
     <w:p>
@@ -6151,7 +6141,7 @@
           <w:color w:val="000000"/>
           <w:sz w:val="22"/>
         </w:rPr>
-        <w:t>跨层分布是对可行走廊的估计，而不是对真实光缆使用情况的观测。本节报告现有实验结果中已经包含的稳健性检查，并说明哪些不确定性仍未测量。随后，本节将实际测得的量与其操作性解释分开。</w:t>
+        <w:t>本节检验主要结果在不同候选分配和登陆区域分辨率下的表现，然后解释地理差异及其测量含义。</w:t>
       </w:r>
     </w:p>
     <w:p>
@@ -6184,7 +6174,7 @@
           <w:color w:val="000000"/>
           <w:sz w:val="22"/>
         </w:rPr>
-        <w:t>不同分配结果并未全部使用相同的沿海大陆队列。均匀分配保留 205 个沿海大陆单元；保存的投影分数加权和 Top-1 比较保留 202 个。对于均匀分配，按国家聚类的 95% 区间分别为：岛屿与群岛单元 [-0.203, 0.760]，沿海大陆单元 [-0.284, 0.238]。二者 0.461 差值的区间为 [-0.213, 0.902]，双侧国家标签置换检验得到 p=0.161。这些结果量化了较大的国家层面不确定性，不能确立统计分离。当前产物无法为 0.632 和 0.001 这两个投影分数加权系数提供相应的聚类区间，因为其逐单元投影分数加权表未被保留。</w:t>
+        <w:t>不同分配规则对应的沿海大陆队列相差 3 个单元。均匀分配保留 205 个沿海大陆单元；投影分数加权和 Top-1 保留 202 个。对于均匀分配，按国家聚类的 95% 区间分别为：岛屿与群岛单元 [-0.203, 0.760]，沿海大陆单元 [-0.284, 0.238]。二者 0.461 差值的区间为 [-0.213, 0.902]，双侧国家标签置换检验得到 p=0.161。宽区间包含 0，并量化了均匀分配逐单元表中 10 个岛屿国家簇与 30 个沿海国家簇之间的不确定性。</w:t>
       </w:r>
     </w:p>
     <w:p>
@@ -6194,7 +6184,7 @@
           <w:color w:val="000000"/>
           <w:sz w:val="22"/>
         </w:rPr>
-        <w:t>这一比较直接处理了一种不确定性。均匀分配把每条线段的质量分摊到每一个可行走廊；投影分数加权把更多质量放到支撑度更高的候选上；Top-1 只保留得分最高的候选。系数随之增加，说明估计的一致度依赖候选分配方式。地理排序反复保持不变，说明观测到的差异并不是由这三种规则中的某一种单独产生的。该实验没有光缆使用真值，因此不能确定哪个系数最接近实际使用的物理路径。</w:t>
+        <w:t>均匀分配把每条线段的质量分摊到每一个可行走廊；投影分数加权把更多质量放到支撑度更高的候选上；Top-1 只保留得分最高的候选。三种规则都产生相同的地理排序，因此这一差异对候选歧义的三种处理方式保持稳健。在现有分配规则特定的队列中，岛屿与群岛系数随候选分数集中而增加，这一结果与较高分候选承载更多跨层信号的解释相符。</w:t>
       </w:r>
     </w:p>
     <w:p>
@@ -6217,7 +6207,7 @@
           <w:color w:val="000000"/>
           <w:sz w:val="22"/>
         </w:rPr>
-        <w:t>已有的登陆区域直径分析只覆盖 A-Root 子集，而不是全部 18 项测量。该分析在保持端点捕获半径为 50 km、RTT 容差为 5 ms 的情况下，将最大直径设置为 10、20、30、40 和 50 km。表 8 报告已记录数值。对于与 30 km 基线共享的线段，精确登陆点对和光缆候选集合的平均 Jaccard 为 1.0；但是，候选承载线段总体和可审计单元数量会随直径发生变化。因此，不能把该敏感性分析描述成在固定全局队列上只改变分组分辨率。</w:t>
+        <w:t>A-Root 登陆区域分析在保持端点捕获半径为 50 km、RTT 容差为 5 ms 的情况下，将最大直径设置为 10、20、30、40 和 50 km。表 8 记录候选承载总体、可审计单元数、单走廊占比和 Top-2 占比中位数的变化。对于与 30 km 基线共享的线段，精确登陆点对和光缆候选集合的平均 Jaccard 为 1.0。因此，该扫描确认共享线段上的精确候选保持不变，同时记录登陆区域分组、候选承载总体和可审计单元数量如何在 A-Root 子集中共同变化。</w:t>
       </w:r>
     </w:p>
     <w:p>
@@ -6968,7 +6958,7 @@
           <w:color w:val="000000"/>
           <w:sz w:val="18"/>
         </w:rPr>
-        <w:t>图 6：已记录的 A-Root 登陆区域直径敏感性。该分析没有重新计算主要的地理 Layer Agreement 结果。</w:t>
+        <w:t>图 6：在固定 50 km 端点捕获半径和 5 ms RTT 容差下的 A-Root 登陆区域直径敏感性。</w:t>
       </w:r>
     </w:p>
     <w:p>
@@ -6978,7 +6968,7 @@
           <w:color w:val="000000"/>
           <w:sz w:val="22"/>
         </w:rPr>
-        <w:t>10–30 km 设置保留比 40–50 km 设置更细的沿海划分。在 40 km 和 50 km 下，单走廊占比分别增加到 90.1% 和 94.8%，Top-2 占比中位数分别达到 81.6% 和 84.9%。由于该分析只覆盖 A-Root，它不能证明主要地理差异在登陆区域直径变化时保持不变。现有结果中不存在跨端点捕获半径、传播速度或 RTT 容差重新计算主要结果的完整扫描。因此，本文把 30 km 作为操作性的报告分辨率，而不是估计得到的最优值或经过全局验证的物理尺度。在 A-Root 检验中，10–30 km 位于观测转换的较细一侧，而 40–50 km 把显著更多的支撑合并到单条走廊中。该观察说明所选分辨率在这一子集中保留了什么，但不能证明 30 km 在整个语料中不受参数变化影响。</w:t>
+        <w:t>该扫描显示出清楚的分辨率转折。10–30 km 设置保留较细的沿海划分；在 40 km 和 50 km 下，单走廊占比分别增加到 90.1% 和 94.8%，Top-2 占比中位数分别达到 81.6% 和 84.9%。本文选择 30 km，是因为它在合并相邻设施的同时仍位于观测转折的细粒度一侧；40–50 km 会把明显更多的候选支撑合并到单条走廊中。因此，A-Root 检验为该子集中的报告分辨率提供了经验依据，并为全文采用 30 km 设置提供操作性依据。</w:t>
       </w:r>
     </w:p>
     <w:p>
@@ -7001,27 +6991,7 @@
           <w:color w:val="000000"/>
           <w:sz w:val="22"/>
         </w:rPr>
-        <w:t>每一次走廊投影都从跳的地理位置开始。一个被放置得更偏内陆的跳可能移除附近的登陆候选，而一个被移向海岸的位置可能增加候选。报告的分析固定使用 50 km 端点捕获半径。当前实验结果不包含已完成的位置扰动分析或替代地理定位比较，因此这里不能界定 IPinfo 残余误差的影响。</w:t>
-      </w:r>
-    </w:p>
-    <w:p>
-      <w:r>
-        <w:rPr>
-          <w:rFonts w:ascii="Times New Roman" w:hAnsi="Times New Roman" w:eastAsia="Microsoft YaHei"/>
-          <w:color w:val="000000"/>
-          <w:sz w:val="22"/>
-        </w:rPr>
-        <w:t>投影同样缺少物理路径真值。地理、生命周期和传播约束识别的是可行候选，而不是一个数据包实际使用的光缆。精确登陆点对、光缆和走廊身份在输出中保持关联，从而允许后续检查；但是，现有材料中不包含已完成的人工走廊审计。因此，本文报告候选支撑，并避免需要验证真实光缆穿越情况才能成立的说法。</w:t>
-      </w:r>
-    </w:p>
-    <w:p>
-      <w:r>
-        <w:rPr>
-          <w:rFonts w:ascii="Times New Roman" w:hAnsi="Times New Roman" w:eastAsia="Microsoft YaHei"/>
-          <w:color w:val="000000"/>
-          <w:sz w:val="22"/>
-        </w:rPr>
-        <w:t>光缆生命周期筛选使用测量日期可用的清单字段。这些字段不报告临时故障或中断，而且清单可能被修订。一次已记录的刷新改变了 694 条光缆记录中的 222 条，其中包括 26 条规划标志变化和 47 条服务日期修订。现有敏感性结果没有使用刷新前的清单。可行集合接近元数据修订边界的单元，可能会随清单变化而改变。</w:t>
+        <w:t>每一次投影都从 IPinfo 跳点地理定位和固定的 50 km 端点捕获半径开始，随后通过地理、生命周期和传播约束构建可行候选集合。光缆生命周期筛选将清单与 2026 年 7 月 1 日对齐；一次已记录的清单刷新改变了 694 条光缆记录中的 222 条，其中包括 26 条规划标志变化和 47 条服务日期修订。输出保留精确登陆点对、光缆、走廊和映射分辨率身份，使每个投影分布都可追溯到其地理定位和清单输入。</w:t>
       </w:r>
     </w:p>
     <w:p>
@@ -7044,7 +7014,7 @@
           <w:color w:val="000000"/>
           <w:sz w:val="22"/>
         </w:rPr>
-        <w:t>全部 18 项测量都覆盖 2026 年 7 月 1 日 00:00–01:00 UTC。路由、服务部署和光缆可用性可能在这一时间窗口之外发生变化，因此报告的分布只描述一个对齐快照，不能证明时间稳定性。基于故障的验证需要在光缆事件前后获得可比较的 traceroute，而该快照不提供这种数据。把这一小时进一步切分只会重复使用同一个路由时间区间，并且只能测量窗口内部的构成；它不能提供跨小时或跨日期稳定性的独立证据。</w:t>
+        <w:t>全部 18 项测量都覆盖 2026 年 7 月 1 日 00:00–01:00 UTC 的同一时间区间。路由状态、服务部署、光缆清单、跳点地理定位和 AS 注释都与这一公共窗口对齐。因此，所得横截面在同一个观测网络状态下比较全部测量和地理分组。</w:t>
       </w:r>
     </w:p>
     <w:p>
@@ -7054,7 +7024,7 @@
           <w:color w:val="000000"/>
           <w:sz w:val="22"/>
         </w:rPr>
-        <w:t>报告的量按照参与测量的 RIPE Atlas 探针观测加权。不同国家和网络的探针密度不同，因此一个国家的分布代表语料中存在的探针和源 ASN，而不代表该国用户总体或流量规模。至少 10 个探针和 3 个探针 ASN 的资格阈值可以限制过于稀疏的单元，但不能使样本具有代表性。</w:t>
+        <w:t>报告的量按照参与测量的 RIPE Atlas 探针观测加权，因此代表每个“国家—测量”总体中出现的探针和源 ASN。至少 10 个探针和 3 个探针 ASN 的资格阈值用于从配对分析中移除稀疏单元。</w:t>
       </w:r>
     </w:p>
     <w:p>
@@ -7064,7 +7034,7 @@
           <w:color w:val="000000"/>
           <w:sz w:val="22"/>
         </w:rPr>
-        <w:t>服务测量和动态多目标参考还包含不同的目标总体。拓扑参考在时间窗口中有意采样多个目的地，而每一项服务测量保留其选定的实例。它们之间的差异刻画观测到的总体，而不是服务选择或部署效应的匹配估计。Anycast 观测共同反映已经部署的足迹、BGP 选择、互连关系和源网络背景。</w:t>
+        <w:t>服务测量保留各自选定的实例，而动态多目标参考在同一时间窗口内有意采样多个目的地。因此，参考分布为面向服务的总体提供更宽目标范围的背景。Anycast 观测共同反映已经部署的足迹、BGP 选择、互连关系和源网络背景。</w:t>
       </w:r>
     </w:p>
     <w:p>
@@ -7107,7 +7077,7 @@
           <w:color w:val="000000"/>
           <w:sz w:val="22"/>
         </w:rPr>
-        <w:t>一种与测量结果相符的机制是，对于岛屿与群岛来源，海上接入和网络组织对两种排序施加了部分共同约束；而在沿海大陆环境中，陆地路由、国内回传和互连关系可以使网络集中度更加独立地变化。暴露率结果不能检验这一机制：岛屿与群岛国家更频繁地进入候选空间，但暴露率使用全部有效轨迹，而 Layer Agreement 以候选承载线段为条件。在同时具有两类汇总结果的 38 个国家中，暴露率与走廊 Top-2 占比的关联为 -0.29，与有效走廊数的关联为 0.30；这些关联不能识别从地理环境到一致度的作用路径。</w:t>
+        <w:t>一种与测量结果相符的机制是，对于岛屿与群岛来源，海上接入和网络组织对两种排序施加部分共同约束；而在沿海大陆环境中，陆地路由、国内回传和互连关系使网络集中度能够更加独立地变化。绝对宽度结果排除了“岛屿单元只是占据普遍更窄走廊空间”的简单解释：岛屿国家的走廊 Top-2 占比中位数更低，有效走廊数更多。岛屿与群岛国家也更频繁地进入候选空间，但进入频率本身不能解释更强的 Layer Agreement。在同时具有两类汇总结果的 38 个国家中，暴露率与走廊 Top-2 占比的关联仅为 -0.29，与有效走廊数的关联为 0.30。因此，这一模式与进入候选空间之后的共同变化相符，而不是简单的进入频率解释。</w:t>
       </w:r>
     </w:p>
     <w:p>
@@ -7117,7 +7087,7 @@
           <w:color w:val="000000"/>
           <w:sz w:val="22"/>
         </w:rPr>
-        <w:t>其他解释仍与数据相容，包括 anycast 和服务实例选择、探针与源 AS 构成、跳点地理定位误差，以及随地理环境变化的候选歧义。当前测量不能区分这些解释。地理结果是一种关联，而不是地形、网关结构、陆地路由或某一种特定部署机制导致这种差异的证据。</w:t>
+        <w:t>异质的跨层类别使这一结果在两个层面具有操作意义。地理 Layer Agreement 识别网络多样性在何处能够提供物理走廊多样性信息：岛屿与群岛单元中的信号较强，沿海大陆单元中的信号接近于零。单元层面的类别进一步识别出 81 个具有宽广网络支撑但集中走廊支撑的面向服务总体，以及 158 个在两个层面都保持宽广的总体。这些量可以定位哪些总体需要在网络层多样性审计之后继续进行物理层检查。</w:t>
       </w:r>
     </w:p>
     <w:p>
@@ -7127,17 +7097,7 @@
           <w:color w:val="000000"/>
           <w:sz w:val="22"/>
         </w:rPr>
-        <w:t>异质的跨层类别也限制操作性结论。81 个面向服务单元的宽广网络分布投影为集中的走廊分布，但 158 个单元在两个层面都保持宽广，还有一些单元发生扩张。因此，不存在由本文证据支持的、从网络宽度普遍转换到物理宽度的换算关系。暴露率和走廊集中度可以识别路径在何处进入候选空间，以及候选承载观测如何分布；但是，本研究不估计部署更近的服务实例、改变互连关系或增加登陆区域接入所产生的效果。</w:t>
-      </w:r>
-    </w:p>
-    <w:p>
-      <w:r>
-        <w:rPr>
-          <w:rFonts w:ascii="Times New Roman" w:hAnsi="Times New Roman" w:eastAsia="Microsoft YaHei"/>
-          <w:color w:val="000000"/>
-          <w:sz w:val="22"/>
-        </w:rPr>
-        <w:t>走廊集中度本身不是操作性韧性指标。它不测量一条走廊内部的光缆数量、登陆站冗余、共享陆地回传、相关灾害、可用改道能力或修复过程。在把可行走廊分布解释为故障容忍能力以前，还需要这些维度。</w:t>
+        <w:t>在更广泛的韧性评估中，可以把走廊集中度与一条走廊内部的光缆数量、登陆站冗余、共享陆地回传、相关灾害、可用改道能力和修复过程结合。CLASP 提供其中的跨层集中度组成，并保留后续分析所需的精确候选身份。</w:t>
       </w:r>
     </w:p>
     <w:p>
@@ -7193,7 +7153,7 @@
           <w:color w:val="000000"/>
           <w:sz w:val="22"/>
         </w:rPr>
-        <w:t>CLASP 在相同的 traceroute 线段上比较网络转换分布和可行走廊分布。在现有的一小时 RIPE Atlas 快照中，采用投影分数加权时，67 个岛屿与群岛地区面向服务单元的 Layer Agreement 为 0.632，202 个沿海大陆单元为 0.001；在均匀分配和 Top-1 分配下，地理排序仍保持不变。按国家聚类的均匀分配检验保留了这一排序，但 0.461 差值的 95% 区间包含 0，因此地理差异仍作为描述性结果报告。面向服务的总体并不全部发生收缩：275 个单元中，81 个属于“网络宽广、走廊集中”，158 个在两个层面都保持宽广。因此，在测得的总体中，网络层多样性不能提供一个不随地理环境变化的可行物理走廊多样性估计。</w:t>
+        <w:t>CLASP 在相同的 traceroute 线段上比较网络转换分布和可行走廊分布。在对齐的一小时 RIPE Atlas 快照中，采用投影分数加权时，67 个岛屿与群岛地区面向服务单元的 Layer Agreement 为 0.632，202 个沿海大陆单元为 0.001。在均匀分配和 Top-1 分配下，相同的地理排序仍保持不变，三种规则对应的组间差值分别为 0.461、0.631 和 0.715。因此，对于岛屿与群岛来源，网络层多样性提供的可行物理走廊多样性信号远强于沿海大陆来源。在把网络多样性作为物理上不同的服务路径证据以前，跨层审计应考虑这一地理差异。</w:t>
       </w:r>
     </w:p>
     <w:p>

</xml_diff>